<commit_message>
Serve scans from object storage; keep Vercel to the reader, Markdown, and Word.
All 141 papers now have typed transcripts. Page JPEGs and original PDFs stay off the Vercel deploy and are read from GitHub (then Supabase once the archive bucket is uploaded).

Co-authored-by: Cursor <cursoragent@cursor.com>
</commit_message>
<xml_diff>
--- a/public/downloads/high-court-order-reference-arbitration-10-07-24-FULL-TRANSCRIPT.docx
+++ b/public/downloads/high-court-order-reference-arbitration-10-07-24-FULL-TRANSCRIPT.docx
@@ -317,12 +317,23 @@
       <w:r>
         <w:rPr>
           <w:rFonts w:ascii="Times New Roman" w:hAnsi="Times New Roman" w:eastAsia="Times New Roman"/>
+          <w:b w:val="0"/>
+          <w:i w:val="0"/>
+          <w:sz w:val="22"/>
+        </w:rPr>
+        <w:t>shakuntala</w:t>
+      </w:r>
+    </w:p>
+    <w:p>
+      <w:r>
+        <w:rPr>
+          <w:rFonts w:ascii="Times New Roman" w:hAnsi="Times New Roman" w:eastAsia="Times New Roman"/>
           <w:b/>
           <w:i w:val="0"/>
           <w:color w:val="8B2E2E"/>
-          <w:sz w:val="26"/>
+          <w:sz w:val="32"/>
         </w:rPr>
-        <w:t>Page 1 of 4</w:t>
+        <w:t>;~~-~~--·~~L-.... ·--·~· • IN THE HIGH COURT OF BOMBA y AT GOA 2024</w:t>
       </w:r>
     </w:p>
     <w:p>
@@ -333,7 +344,7 @@
           <w:i w:val="0"/>
           <w:sz w:val="22"/>
         </w:rPr>
-        <w:t>:   AAR 13 of 2024</w:t>
+        <w:t>-~cQ.~~~~</w:t>
       </w:r>
     </w:p>
     <w:p>
@@ -344,7 +355,7 @@
           <w:i w:val="0"/>
           <w:sz w:val="22"/>
         </w:rPr>
-        <w:t>[!]~~~.~    ~ L"'V"'-lf:,.:-. \lji'I</w:t>
+        <w:t>APPLN. FOR APPOINTMENT OF ARBITRATOR NO.1J OF</w:t>
       </w:r>
     </w:p>
     <w:p>
@@ -355,7 +366,7 @@
           <w:i w:val="0"/>
           <w:sz w:val="22"/>
         </w:rPr>
-        <w:t>~ - ~ ~ \ ~ - , . . ~ • • ~--   l:J</w:t>
+        <w:t>VIKRAM SHAH</w:t>
       </w:r>
     </w:p>
     <w:p>
@@ -366,7 +377,7 @@
           <w:i w:val="0"/>
           <w:sz w:val="22"/>
         </w:rPr>
-        <w:t>-=..r:-~;t~~,:1:!-~IJ.---~ ....</w:t>
+        <w:t>Versus</w:t>
       </w:r>
     </w:p>
     <w:p>
@@ -377,7 +388,7 @@
           <w:i w:val="0"/>
           <w:sz w:val="22"/>
         </w:rPr>
-        <w:t>,;:}~••.fI!-R</w:t>
+        <w:t>...  APPLICANT</w:t>
       </w:r>
     </w:p>
     <w:p>
@@ -388,7 +399,7 @@
           <w:i w:val="0"/>
           <w:sz w:val="22"/>
         </w:rPr>
-        <w:t xml:space="preserve"> • -· ~-~,...,i.J</w:t>
+        <w:t>CORAM:- .BHARAT P. DESHPANDE, J.</w:t>
       </w:r>
     </w:p>
     <w:p>
@@ -399,7 +410,7 @@
           <w:i w:val="0"/>
           <w:sz w:val="22"/>
         </w:rPr>
-        <w:t>. .</w:t>
+        <w:t>DATED  :-10th July, 2024</w:t>
       </w:r>
     </w:p>
     <w:p>
@@ -410,7 +421,7 @@
           <w:i w:val="0"/>
           <w:sz w:val="22"/>
         </w:rPr>
-        <w:t>L :</w:t>
+        <w:t>P.C.</w:t>
       </w:r>
     </w:p>
     <w:p>
@@ -421,7 +432,7 @@
           <w:i w:val="0"/>
           <w:sz w:val="22"/>
         </w:rPr>
-        <w:t xml:space="preserve">         ..... :1. -</w:t>
+        <w:t>1. Heard Mr. Noorani learned counsel appearing for the applicant.</w:t>
       </w:r>
     </w:p>
     <w:p>
@@ -432,7 +443,7 @@
           <w:i w:val="0"/>
           <w:sz w:val="22"/>
         </w:rPr>
-        <w:t xml:space="preserve">           ••</w:t>
+        <w:t>2. This  is  an application for  the  appointmeJ?.t  of arbitrator under</w:t>
       </w:r>
     </w:p>
     <w:p>
@@ -443,7 +454,7 @@
           <w:i w:val="0"/>
           <w:sz w:val="22"/>
         </w:rPr>
-        <w:t xml:space="preserve">             4</w:t>
+        <w:t>Section 11 ( 6) of Arbitration and  Conciliation Act,  1996.</w:t>
       </w:r>
     </w:p>
     <w:p>
@@ -454,7 +465,7 @@
           <w:i w:val="0"/>
           <w:sz w:val="22"/>
         </w:rPr>
-        <w:t xml:space="preserve">                 •</w:t>
+        <w:t>3. Vide Articles of Association executed on 01.04.2013, the parties</w:t>
       </w:r>
     </w:p>
     <w:p>
@@ -465,7 +476,7 @@
           <w:i w:val="0"/>
           <w:sz w:val="22"/>
         </w:rPr>
-        <w:t xml:space="preserve">                   "'</w:t>
+        <w:t>agreed that in case of dispute arising  out of the  said agreement,  the</w:t>
       </w:r>
     </w:p>
     <w:p>
@@ -476,7 +487,7 @@
           <w:i w:val="0"/>
           <w:sz w:val="22"/>
         </w:rPr>
-        <w:t xml:space="preserve">                     •</w:t>
+        <w:t>same  shall  be  referred  to  the  Arbitrator.  Clause  35  of  the  said</w:t>
       </w:r>
     </w:p>
     <w:p>
@@ -487,7 +498,7 @@
           <w:i w:val="0"/>
           <w:sz w:val="22"/>
         </w:rPr>
-        <w:t xml:space="preserve">                        •</w:t>
+        <w:t>agreement  refers  to  the  intention  of  the  parties  to  go  before  the</w:t>
       </w:r>
     </w:p>
     <w:p>
@@ -498,7 +509,7 @@
           <w:i w:val="0"/>
           <w:sz w:val="22"/>
         </w:rPr>
-        <w:t xml:space="preserve">                          .   :--~!.•</w:t>
+        <w:t>Arbitrator.</w:t>
       </w:r>
     </w:p>
     <w:p>
@@ -509,7 +520,7 @@
           <w:i w:val="0"/>
           <w:sz w:val="22"/>
         </w:rPr>
-        <w:t xml:space="preserve">                               '=C-,"</w:t>
+        <w:t>[Image: Im0]</w:t>
       </w:r>
     </w:p>
     <w:p>
@@ -520,7 +531,7 @@
           <w:i w:val="0"/>
           <w:sz w:val="22"/>
         </w:rPr>
-        <w:t xml:space="preserve">                      r-.:-=--. •            shakuntala</w:t>
+        <w:t>4. Mr.  Noorani submits that party to the first part expired and his</w:t>
       </w:r>
     </w:p>
     <w:p>
@@ -531,7 +542,7 @@
           <w:i w:val="0"/>
           <w:sz w:val="22"/>
         </w:rPr>
-        <w:t>;~~-~~--·~~L-. .·--·~· •                              IN THE HIGH COURT OF BOMBA y AT GOA</w:t>
+        <w:t>legal  heirs  inherited  the  said  property.  Since,  the  partnership  is  not</w:t>
       </w:r>
     </w:p>
     <w:p>
@@ -542,7 +553,7 @@
           <w:i w:val="0"/>
           <w:sz w:val="22"/>
         </w:rPr>
-        <w:t>t~c.. -~cQ.~~~~ APPLN. FOR APPOINTMENT OF ARBITRATOR NO.1J OF 2024</w:t>
+        <w:t>going forward  and  legal  representatives  are  not cooperating,  a  notice to Respondents. However, vide</w:t>
       </w:r>
     </w:p>
     <w:p>
@@ -553,7 +564,7 @@
           <w:i w:val="0"/>
           <w:sz w:val="22"/>
         </w:rPr>
-        <w:t xml:space="preserve">                                                                                               ... APPLICANT</w:t>
+        <w:t>having an arbitration clause was issued</w:t>
       </w:r>
     </w:p>
     <w:p>
@@ -564,7 +575,7 @@
           <w:i w:val="0"/>
           <w:sz w:val="22"/>
         </w:rPr>
-        <w:t xml:space="preserve">                                        VIKRAM SHAH</w:t>
+        <w:t>refused  to  refer the  matter to  the</w:t>
       </w:r>
     </w:p>
     <w:p>
@@ -575,7 +586,7 @@
           <w:i w:val="0"/>
           <w:sz w:val="22"/>
         </w:rPr>
-        <w:t xml:space="preserve">                                          Versus</w:t>
+        <w:t>their reply  dated  11.03.2024,  they</w:t>
       </w:r>
     </w:p>
     <w:p>
@@ -586,7 +597,7 @@
           <w:i w:val="0"/>
           <w:sz w:val="22"/>
         </w:rPr>
-        <w:t xml:space="preserve">                                        RIV A TRINDADE AND 3 ORS                               ... ,RESPONDENTS</w:t>
+        <w:t>Arbitrator.</w:t>
       </w:r>
     </w:p>
     <w:p>
@@ -597,7 +608,7 @@
           <w:i w:val="0"/>
           <w:sz w:val="22"/>
         </w:rPr>
-        <w:t xml:space="preserve">                                        Mr..Kaif Noorani, Advocate for the Applicant.</w:t>
+        <w:t>[Image: Im0]</w:t>
       </w:r>
     </w:p>
     <w:p>
@@ -608,7 +619,7 @@
           <w:i w:val="0"/>
           <w:sz w:val="22"/>
         </w:rPr>
-        <w:t xml:space="preserve">                                                             CORAM:- .BHARAT P. DESHPANDE, J.</w:t>
+        <w:t>on 07.08.2024.</w:t>
       </w:r>
     </w:p>
     <w:p>
@@ -619,7 +630,7 @@
           <w:i w:val="0"/>
           <w:sz w:val="22"/>
         </w:rPr>
-        <w:t xml:space="preserve">                                                             DATED :- 10th July, 2024</w:t>
+        <w:t>5. Issue notice to Respondents returnable</w:t>
       </w:r>
     </w:p>
     <w:p>
@@ -630,7 +641,7 @@
           <w:i w:val="0"/>
           <w:sz w:val="22"/>
         </w:rPr>
-        <w:t xml:space="preserve">                                        P.C.</w:t>
+        <w:t>by other modes is permitted.</w:t>
       </w:r>
     </w:p>
     <w:p>
@@ -641,7 +652,7 @@
           <w:i w:val="0"/>
           <w:sz w:val="22"/>
         </w:rPr>
-        <w:t xml:space="preserve">                                        1.     Heard Mr. Noorani learned counsel appearing for the applicant.</w:t>
+        <w:t>6. Apart from regular service, service</w:t>
       </w:r>
     </w:p>
     <w:p>
@@ -652,7 +663,20 @@
           <w:i w:val="0"/>
           <w:sz w:val="22"/>
         </w:rPr>
-        <w:t xml:space="preserve">                                        2.       This is an application for the appointmeJ?.t of arbitrator under</w:t>
+        <w:t>BHARAT P. DESHPANDE, J.</w:t>
+      </w:r>
+    </w:p>
+    <w:p/>
+    <w:p>
+      <w:r>
+        <w:rPr>
+          <w:rFonts w:ascii="Times New Roman" w:hAnsi="Times New Roman" w:eastAsia="Times New Roman"/>
+          <w:b/>
+          <w:i w:val="0"/>
+          <w:color w:val="8B2E2E"/>
+          <w:sz w:val="32"/>
+        </w:rPr>
+        <w:t>Dated: 30/07/2024 u_ \'L9,~ INTHEHIGHCOURTOFBOMBAYATGOA, PORVM.W .... 1 2024 Ap lication fot· Al loinllnenl of Arbitrator No.</w:t>
       </w:r>
     </w:p>
     <w:p>
@@ -663,7 +687,7 @@
           <w:i w:val="0"/>
           <w:sz w:val="22"/>
         </w:rPr>
-        <w:t xml:space="preserve">                                        Section 11 (6) of Arbitration and Conciliation Act, 1996.</w:t>
+        <w:t>Vikram Shah.,</w:t>
       </w:r>
     </w:p>
     <w:p>
@@ -674,7 +698,7 @@
           <w:i w:val="0"/>
           <w:sz w:val="22"/>
         </w:rPr>
-        <w:t xml:space="preserve">                                        3.     Vide Articles of Association executed on 01.04.2013, the parties</w:t>
+        <w:t>\</w:t>
       </w:r>
     </w:p>
     <w:p>
@@ -685,7 +709,7 @@
           <w:i w:val="0"/>
           <w:sz w:val="22"/>
         </w:rPr>
-        <w:t xml:space="preserve">                                        agreed that in case of dispute arising out of the said agreement, the</w:t>
+        <w:t>... Applicant</w:t>
       </w:r>
     </w:p>
     <w:p>
@@ -696,7 +720,7 @@
           <w:i w:val="0"/>
           <w:sz w:val="22"/>
         </w:rPr>
-        <w:t xml:space="preserve">                                        same shall be referred to the Arbitrator. Clause 35 of the said</w:t>
+        <w:t>Versus</w:t>
       </w:r>
     </w:p>
     <w:p>
@@ -707,7 +731,7 @@
           <w:i w:val="0"/>
           <w:sz w:val="22"/>
         </w:rPr>
-        <w:t xml:space="preserve">                                        agreement refers to the intention of the parties to go before the</w:t>
+        <w:t>i</w:t>
       </w:r>
     </w:p>
     <w:p>
@@ -718,7 +742,7 @@
           <w:i w:val="0"/>
           <w:sz w:val="22"/>
         </w:rPr>
-        <w:t xml:space="preserve">                                        Arbitrator.</w:t>
+        <w:t>Riva Trindadc And 3 Ors.,</w:t>
       </w:r>
     </w:p>
     <w:p>
@@ -729,7 +753,7 @@
           <w:i w:val="0"/>
           <w:sz w:val="22"/>
         </w:rPr>
-        <w:t xml:space="preserve">                                        4.      Mr. Noorani submits that party to the first part expired and his</w:t>
+        <w:t>... Respondents</w:t>
       </w:r>
     </w:p>
     <w:p>
@@ -740,7 +764,7 @@
           <w:i w:val="0"/>
           <w:sz w:val="22"/>
         </w:rPr>
-        <w:t xml:space="preserve">                                        legal heirs inherited the said property. Since, the partnership is not</w:t>
+        <w:t>To,</w:t>
       </w:r>
     </w:p>
     <w:p>
@@ -751,7 +775,7 @@
           <w:i w:val="0"/>
           <w:sz w:val="22"/>
         </w:rPr>
-        <w:t xml:space="preserve">                                        going forward and legal representatives are not cooperating, a notice</w:t>
+        <w:t>Paula,</w:t>
       </w:r>
     </w:p>
     <w:p>
@@ -762,7 +786,7 @@
           <w:i w:val="0"/>
           <w:sz w:val="22"/>
         </w:rPr>
-        <w:t xml:space="preserve">                                                                             Pugc I of 2</w:t>
+        <w:t>R-1 Mr.  Riva Trindade,  Major of age,  R/o Palbrika  Mansion,  NIO  Circle,  Dona</w:t>
       </w:r>
     </w:p>
     <w:p>
@@ -773,20 +797,7 @@
           <w:i w:val="0"/>
           <w:sz w:val="22"/>
         </w:rPr>
-        <w:t xml:space="preserve">                                                                            10th July. 2024</w:t>
-      </w:r>
-    </w:p>
-    <w:p/>
-    <w:p>
-      <w:r>
-        <w:rPr>
-          <w:rFonts w:ascii="Times New Roman" w:hAnsi="Times New Roman" w:eastAsia="Times New Roman"/>
-          <w:b/>
-          <w:i w:val="0"/>
-          <w:color w:val="8B2E2E"/>
-          <w:sz w:val="26"/>
-        </w:rPr>
-        <w:t>Page 2 of 4</w:t>
+        <w:t>Tiswadi, Goa - 403004</w:t>
       </w:r>
     </w:p>
     <w:p>
@@ -797,7 +808,7 @@
           <w:i w:val="0"/>
           <w:sz w:val="22"/>
         </w:rPr>
-        <w:t>, .,,,,,</w:t>
+        <w:t>Dona</w:t>
       </w:r>
     </w:p>
     <w:p>
@@ -808,7 +819,7 @@
           <w:i w:val="0"/>
           <w:sz w:val="22"/>
         </w:rPr>
-        <w:t xml:space="preserve">                                         : AAR 13 of202 4</w:t>
+        <w:t>R-2 Mrs.  Albertina  Trindade,  Major  of age,  R/o  Palbrika  Mansion,  NIO  Circle,</w:t>
       </w:r>
     </w:p>
     <w:p>
@@ -819,7 +830,7 @@
           <w:i w:val="0"/>
           <w:sz w:val="22"/>
         </w:rPr>
-        <w:t xml:space="preserve">                                                                ts. However, vid e</w:t>
+        <w:t>Paula) Tiswadi, Goa - 403004.</w:t>
       </w:r>
     </w:p>
     <w:p>
@@ -830,7 +841,7 @@
           <w:i w:val="0"/>
           <w:sz w:val="22"/>
         </w:rPr>
-        <w:t xml:space="preserve">           having an arbitration clause was issued to Responden</w:t>
+        <w:t>Paula,</w:t>
       </w:r>
     </w:p>
     <w:p>
@@ -841,7 +852,7 @@
           <w:i w:val="0"/>
           <w:sz w:val="22"/>
         </w:rPr>
-        <w:t xml:space="preserve">                                                                 the matter to the</w:t>
+        <w:t>R-3 Mrs. Karita Trindade, Major of age,  R/o Palbrika Mansion, NIO Circle,  Dona</w:t>
       </w:r>
     </w:p>
     <w:p>
@@ -852,7 +863,7 @@
           <w:i w:val="0"/>
           <w:sz w:val="22"/>
         </w:rPr>
-        <w:t xml:space="preserve">           their reply dated 11.03.2024, they refused to refer</w:t>
+        <w:t>Tiswadi, Goa -403004.</w:t>
       </w:r>
     </w:p>
     <w:p>
@@ -863,7 +874,7 @@
           <w:i w:val="0"/>
           <w:sz w:val="22"/>
         </w:rPr>
-        <w:t xml:space="preserve">           Arbitrator.</w:t>
+        <w:t>54  years,</w:t>
       </w:r>
     </w:p>
     <w:p>
@@ -874,7 +885,7 @@
           <w:i w:val="0"/>
           <w:sz w:val="22"/>
         </w:rPr>
-        <w:t xml:space="preserve">           5.   Issue notice to Respondents returnable on 07.08.2024.</w:t>
+        <w:t>~ Mr. ·Murlidhar  Sadqrangani,  s/o  Shamdas  J~taram  Sadarangani,  Aged</w:t>
       </w:r>
     </w:p>
     <w:p>
@@ -885,7 +896,7 @@
           <w:i w:val="0"/>
           <w:sz w:val="22"/>
         </w:rPr>
-        <w:t xml:space="preserve">                                                                        permitted.</w:t>
+        <w:t>Indian, R/o S-3, Ejen Hall, Dr. Annie Beasant Road, Worli, Mumbai - 400018-.</w:t>
       </w:r>
     </w:p>
     <w:p>
@@ -896,7 +907,7 @@
           <w:i w:val="0"/>
           <w:sz w:val="22"/>
         </w:rPr>
-        <w:t xml:space="preserve">           6.   Apart from regular service, service by other modes is</w:t>
+        <w:t>WHEREAS the above named Applicant through Advocate Kaif Noorani, has filed to</w:t>
       </w:r>
     </w:p>
     <w:p>
@@ -907,20 +918,7 @@
           <w:i w:val="0"/>
           <w:sz w:val="22"/>
         </w:rPr>
-        <w:t xml:space="preserve">                                               BHARAT P. DESHPANDE, J.</w:t>
-      </w:r>
-    </w:p>
-    <w:p/>
-    <w:p>
-      <w:r>
-        <w:rPr>
-          <w:rFonts w:ascii="Times New Roman" w:hAnsi="Times New Roman" w:eastAsia="Times New Roman"/>
-          <w:b/>
-          <w:i w:val="0"/>
-          <w:color w:val="8B2E2E"/>
-          <w:sz w:val="26"/>
-        </w:rPr>
-        <w:t>Page 3 of 4</w:t>
+        <w:t>for</w:t>
       </w:r>
     </w:p>
     <w:p>
@@ -931,7 +929,7 @@
           <w:i w:val="0"/>
           <w:sz w:val="22"/>
         </w:rPr>
-        <w:t>2024</w:t>
+        <w:t>this  Hon'ble  Court the above  Application  for  Appointment of Arbitrator  No.13/2024</w:t>
       </w:r>
     </w:p>
     <w:p>
@@ -942,7 +940,7 @@
           <w:i w:val="0"/>
           <w:sz w:val="22"/>
         </w:rPr>
-        <w:t xml:space="preserve">                                                       No. ,J/AAR No.13-2 024/gl'l (f 1</w:t>
+        <w:t>11 of the Arbitration  and  Conciliati0n Act, 1996</w:t>
       </w:r>
     </w:p>
     <w:p>
@@ -953,7 +951,7 @@
           <w:i w:val="0"/>
           <w:sz w:val="22"/>
         </w:rPr>
-        <w:t xml:space="preserve">                                                       Dated: 30/07/2 024</w:t>
+        <w:t>appointment of Arbitrator under  Section</w:t>
       </w:r>
     </w:p>
     <w:p>
@@ -964,7 +962,7 @@
           <w:i w:val="0"/>
           <w:sz w:val="22"/>
         </w:rPr>
-        <w:t xml:space="preserve">                   INTHEH IGHCO URTOF BOMBA YATGO A, PORVM .W ....                    u\'L9 ,~</w:t>
+        <w:t>(copy enclosed). •</w:t>
       </w:r>
     </w:p>
     <w:p>
@@ -975,7 +973,7 @@
           <w:i w:val="0"/>
           <w:sz w:val="22"/>
         </w:rPr>
-        <w:t xml:space="preserve">                    Ap lication fot· Al loinllne nl of Arbitra tor No. 1    2024</w:t>
+        <w:t>AND  WHEREAS the above Application for Appointment of Arbitrator No. 13/2024,</w:t>
       </w:r>
     </w:p>
     <w:p>
@@ -986,7 +984,7 @@
           <w:i w:val="0"/>
           <w:sz w:val="22"/>
         </w:rPr>
-        <w:t xml:space="preserve">                                                                               ... Applican t</w:t>
+        <w:t>came up before this Hon'ble Court (Coram:  BHARAT  P.  DESHPANDE,  J.) on 10/07/2024</w:t>
       </w:r>
     </w:p>
     <w:p>
@@ -997,7 +995,7 @@
           <w:i w:val="0"/>
           <w:sz w:val="22"/>
         </w:rPr>
-        <w:t xml:space="preserve">       Vikram Shah.,</w:t>
+        <w:t>has</w:t>
       </w:r>
     </w:p>
     <w:p>
@@ -1008,7 +1006,7 @@
           <w:i w:val="0"/>
           <w:sz w:val="22"/>
         </w:rPr>
-        <w:t xml:space="preserve">                          \~</w:t>
+        <w:t>and upon hearing Mr.  Kaif Noorani,  Advocate  for  the Applicant;  this  Hon'ble  Court</w:t>
       </w:r>
     </w:p>
     <w:p>
@@ -1019,7 +1017,19 @@
           <w:i w:val="0"/>
           <w:sz w:val="22"/>
         </w:rPr>
-        <w:t>a      Versus             i</w:t>
+        <w:t>passed the following order:</w:t>
+      </w:r>
+    </w:p>
+    <w:p>
+      <w:r>
+        <w:rPr>
+          <w:rFonts w:ascii="Times New Roman" w:hAnsi="Times New Roman" w:eastAsia="Times New Roman"/>
+          <w:b/>
+          <w:i w:val="0"/>
+          <w:color w:val="8B2E2E"/>
+          <w:sz w:val="26"/>
+        </w:rPr>
+        <w:t>P.C.</w:t>
       </w:r>
     </w:p>
     <w:p>
@@ -1030,7 +1040,7 @@
           <w:i w:val="0"/>
           <w:sz w:val="22"/>
         </w:rPr>
-        <w:t xml:space="preserve">                                                                               ... Respond ents</w:t>
+        <w:t>applicant.</w:t>
       </w:r>
     </w:p>
     <w:p>
@@ -1041,7 +1051,7 @@
           <w:i w:val="0"/>
           <w:sz w:val="22"/>
         </w:rPr>
-        <w:t xml:space="preserve">       Riva Trindadc And 3 Ors.,</w:t>
+        <w:t>1. Heard Mr. Noorani learned counsel appearing for the</w:t>
       </w:r>
     </w:p>
     <w:p>
@@ -1052,7 +1062,7 @@
           <w:i w:val="0"/>
           <w:sz w:val="22"/>
         </w:rPr>
-        <w:t xml:space="preserve">       To,</w:t>
+        <w:t>2. This is an application for the appointment of arbitrator under</w:t>
       </w:r>
     </w:p>
     <w:p>
@@ -1063,7 +1073,7 @@
           <w:i w:val="0"/>
           <w:sz w:val="22"/>
         </w:rPr>
-        <w:t xml:space="preserve">        Mr. Riva Trindade , Major of age, R/o Palbrika Mansion , NIO Circle, Dona Paula,</w:t>
+        <w:t>Section 11(6) of Arbitration and Conciliation Act, 1996.</w:t>
       </w:r>
     </w:p>
     <w:p>
@@ -1074,7 +1084,7 @@
           <w:i w:val="0"/>
           <w:sz w:val="22"/>
         </w:rPr>
-        <w:t xml:space="preserve">        R-1</w:t>
+        <w:t>3. VideArticles of Association executed on 01.04.2013, the parties</w:t>
       </w:r>
     </w:p>
     <w:p>
@@ -1085,7 +1095,7 @@
           <w:i w:val="0"/>
           <w:sz w:val="22"/>
         </w:rPr>
-        <w:t xml:space="preserve">        Tiswadi, Goa - 403004</w:t>
+        <w:t>agreed that in case of dispute arising out of the said agreement, the</w:t>
       </w:r>
     </w:p>
     <w:p>
@@ -1096,7 +1106,7 @@
           <w:i w:val="0"/>
           <w:sz w:val="22"/>
         </w:rPr>
-        <w:t xml:space="preserve">    R-2 Mrs. Albertina Trindade, Major of age, R/o Palbrika Mansion, NIO Circle, Dona</w:t>
+        <w:t>said</w:t>
       </w:r>
     </w:p>
     <w:p>
@@ -1107,7 +1117,7 @@
           <w:i w:val="0"/>
           <w:sz w:val="22"/>
         </w:rPr>
-        <w:t xml:space="preserve">        Paula) Tiswadi, Goa - 403004.</w:t>
+        <w:t>same shall be referred to the Arbitrator. Clause 35 of the ,</w:t>
       </w:r>
     </w:p>
     <w:p>
@@ -1118,7 +1128,7 @@
           <w:i w:val="0"/>
           <w:sz w:val="22"/>
         </w:rPr>
-        <w:t xml:space="preserve">    R-3 Mrs. Karita Trindade, Major of age, R/o Palbrika Mansion, NIO Circle, Dona Paula,</w:t>
+        <w:t>agreement refers to the intention of the parties lo go before the</w:t>
       </w:r>
     </w:p>
     <w:p>
@@ -1129,7 +1139,7 @@
           <w:i w:val="0"/>
           <w:sz w:val="22"/>
         </w:rPr>
-        <w:t xml:space="preserve">        Tiswadi, Goa - 403004.</w:t>
+        <w:t>Arbitrator.</w:t>
       </w:r>
     </w:p>
     <w:p>
@@ -1140,7 +1150,7 @@
           <w:i w:val="0"/>
           <w:sz w:val="22"/>
         </w:rPr>
-        <w:t xml:space="preserve">    ~ Mr. ·Murlidh ar Sadqrangani, s/o Shamdas J~taram Sadarangani, Aged        54 years,</w:t>
+        <w:t>. Mr. Noorani submits that party to the first part CA']lired and his</w:t>
       </w:r>
     </w:p>
     <w:p>
@@ -1151,7 +1161,7 @@
           <w:i w:val="0"/>
           <w:sz w:val="22"/>
         </w:rPr>
-        <w:t xml:space="preserve">        Indian, R/o S-3, Ejen Hall, Dr. Annie Beasant Road, Worli, Mumbai - 400018-.</w:t>
+        <w:t>4</w:t>
       </w:r>
     </w:p>
     <w:p>
@@ -1162,7 +1172,7 @@
           <w:i w:val="0"/>
           <w:sz w:val="22"/>
         </w:rPr>
-        <w:t xml:space="preserve">             WHEREAS the above named Applicant through Advocate Kaif Noorani, has filed to</w:t>
+        <w:t>legal heirs inherited the said properly. Since, the partnership is not</w:t>
       </w:r>
     </w:p>
     <w:p>
@@ -1173,7 +1183,7 @@
           <w:i w:val="0"/>
           <w:sz w:val="22"/>
         </w:rPr>
-        <w:t xml:space="preserve">       this Hon'ble Court the above Application for Appointm ent of Arbitrato r No.13/20 24 for</w:t>
+        <w:t>going forward and legal representatives ,u·c not coo11crnting, n notice</w:t>
       </w:r>
     </w:p>
     <w:p>
@@ -1184,7 +1194,7 @@
           <w:i w:val="0"/>
           <w:sz w:val="22"/>
         </w:rPr>
-        <w:t xml:space="preserve">       appointm ent of Arbitrato r under Section 11 of the Arbitrati on and Conciliati0n Act, 1996</w:t>
+        <w:t>having an arbitration clause was issued lo 'Respondents. llowcvcr, vidc</w:t>
       </w:r>
     </w:p>
     <w:p>
@@ -1195,7 +1205,7 @@
           <w:i w:val="0"/>
           <w:sz w:val="22"/>
         </w:rPr>
-        <w:t xml:space="preserve">       (copy enclosed).                    •</w:t>
+        <w:t>their reply dated 11.03.2024, they 1•cfuscd to rcfci• the n1ntter· to the</w:t>
       </w:r>
     </w:p>
     <w:p>
@@ -1206,7 +1216,19 @@
           <w:i w:val="0"/>
           <w:sz w:val="22"/>
         </w:rPr>
-        <w:t xml:space="preserve">             AND WHEREAS the above Application for Appointm ent of Arbitrato r No. 13/2024 ,</w:t>
+        <w:t>[Image: Im0]</w:t>
+      </w:r>
+    </w:p>
+    <w:p/>
+    <w:p>
+      <w:r>
+        <w:rPr>
+          <w:rFonts w:ascii="Times New Roman" w:hAnsi="Times New Roman" w:eastAsia="Times New Roman"/>
+          <w:b w:val="0"/>
+          <w:i w:val="0"/>
+          <w:sz w:val="22"/>
+        </w:rPr>
+        <w:t>Arbitrator.</w:t>
       </w:r>
     </w:p>
     <w:p>
@@ -1217,7 +1239,7 @@
           <w:i w:val="0"/>
           <w:sz w:val="22"/>
         </w:rPr>
-        <w:t xml:space="preserve">       came up before this Hon'ble Court (Coram: BHARAT P. DESHPANDE, J.) on 10/07/20 24</w:t>
+        <w:t>returnable on 07.08.2024.</w:t>
       </w:r>
     </w:p>
     <w:p>
@@ -1228,7 +1250,7 @@
           <w:i w:val="0"/>
           <w:sz w:val="22"/>
         </w:rPr>
-        <w:t xml:space="preserve">       and upon hearing Mr. Kaif Noorani, Advocate for the Applicant; this Hon'ble Court has</w:t>
+        <w:t>5. Issue notice to Rcspondcnl's</w:t>
       </w:r>
     </w:p>
     <w:p>
@@ -1239,7 +1261,7 @@
           <w:i w:val="0"/>
           <w:sz w:val="22"/>
         </w:rPr>
-        <w:t xml:space="preserve">       passed the following order:</w:t>
+        <w:t>regular service, service by other ,nodes is pcrmi ltcd.</w:t>
       </w:r>
     </w:p>
     <w:p>
@@ -1250,196 +1272,7 @@
           <w:i w:val="0"/>
           <w:sz w:val="22"/>
         </w:rPr>
-        <w:t xml:space="preserve">        P.C.</w:t>
-      </w:r>
-    </w:p>
-    <w:p>
-      <w:r>
-        <w:rPr>
-          <w:rFonts w:ascii="Times New Roman" w:hAnsi="Times New Roman" w:eastAsia="Times New Roman"/>
-          <w:b w:val="0"/>
-          <w:i w:val="0"/>
-          <w:sz w:val="22"/>
-        </w:rPr>
-        <w:t xml:space="preserve">        1.    Heard Mr. Nooran i learned counsel appeari ng for the applican t.</w:t>
-      </w:r>
-    </w:p>
-    <w:p>
-      <w:r>
-        <w:rPr>
-          <w:rFonts w:ascii="Times New Roman" w:hAnsi="Times New Roman" w:eastAsia="Times New Roman"/>
-          <w:b w:val="0"/>
-          <w:i w:val="0"/>
-          <w:sz w:val="22"/>
-        </w:rPr>
-        <w:t xml:space="preserve">        2. This is an applica tion for the appoint ment of arbitrat or under</w:t>
-      </w:r>
-    </w:p>
-    <w:p>
-      <w:r>
-        <w:rPr>
-          <w:rFonts w:ascii="Times New Roman" w:hAnsi="Times New Roman" w:eastAsia="Times New Roman"/>
-          <w:b w:val="0"/>
-          <w:i w:val="0"/>
-          <w:sz w:val="22"/>
-        </w:rPr>
-        <w:t xml:space="preserve">        Section 11(6) of Arbitra tion and Concilia tion Act, 1996.</w:t>
-      </w:r>
-    </w:p>
-    <w:p>
-      <w:r>
-        <w:rPr>
-          <w:rFonts w:ascii="Times New Roman" w:hAnsi="Times New Roman" w:eastAsia="Times New Roman"/>
-          <w:b w:val="0"/>
-          <w:i w:val="0"/>
-          <w:sz w:val="22"/>
-        </w:rPr>
-        <w:t xml:space="preserve">        3.     VideAr ticles of Associa tion execute d on 01.04.20 13, the parties</w:t>
-      </w:r>
-    </w:p>
-    <w:p>
-      <w:r>
-        <w:rPr>
-          <w:rFonts w:ascii="Times New Roman" w:hAnsi="Times New Roman" w:eastAsia="Times New Roman"/>
-          <w:b w:val="0"/>
-          <w:i w:val="0"/>
-          <w:sz w:val="22"/>
-        </w:rPr>
-        <w:t xml:space="preserve">        agreed that in case of dispute arising out of the said agreem ent, the</w:t>
-      </w:r>
-    </w:p>
-    <w:p>
-      <w:r>
-        <w:rPr>
-          <w:rFonts w:ascii="Times New Roman" w:hAnsi="Times New Roman" w:eastAsia="Times New Roman"/>
-          <w:b w:val="0"/>
-          <w:i w:val="0"/>
-          <w:sz w:val="22"/>
-        </w:rPr>
-        <w:t xml:space="preserve">        same shall be referred to the Arbitra tor. Clause 35 of the,</w:t>
-      </w:r>
-    </w:p>
-    <w:p>
-      <w:r>
-        <w:rPr>
-          <w:rFonts w:ascii="Times New Roman" w:hAnsi="Times New Roman" w:eastAsia="Times New Roman"/>
-          <w:b w:val="0"/>
-          <w:i w:val="0"/>
-          <w:sz w:val="22"/>
-        </w:rPr>
-        <w:t xml:space="preserve">                                                                     said</w:t>
-      </w:r>
-    </w:p>
-    <w:p>
-      <w:r>
-        <w:rPr>
-          <w:rFonts w:ascii="Times New Roman" w:hAnsi="Times New Roman" w:eastAsia="Times New Roman"/>
-          <w:b w:val="0"/>
-          <w:i w:val="0"/>
-          <w:sz w:val="22"/>
-        </w:rPr>
-        <w:t xml:space="preserve">        agreem ent refers to the intentio n of the parties lo go before the</w:t>
-      </w:r>
-    </w:p>
-    <w:p>
-      <w:r>
-        <w:rPr>
-          <w:rFonts w:ascii="Times New Roman" w:hAnsi="Times New Roman" w:eastAsia="Times New Roman"/>
-          <w:b w:val="0"/>
-          <w:i w:val="0"/>
-          <w:sz w:val="22"/>
-        </w:rPr>
-        <w:t xml:space="preserve">        Arbitra tor.</w:t>
-      </w:r>
-    </w:p>
-    <w:p>
-      <w:r>
-        <w:rPr>
-          <w:rFonts w:ascii="Times New Roman" w:hAnsi="Times New Roman" w:eastAsia="Times New Roman"/>
-          <w:b w:val="0"/>
-          <w:i w:val="0"/>
-          <w:sz w:val="22"/>
-        </w:rPr>
-        <w:t xml:space="preserve">        4.     Mr. Nooran i submits that party to the first part CA']lired and his</w:t>
-      </w:r>
-    </w:p>
-    <w:p>
-      <w:r>
-        <w:rPr>
-          <w:rFonts w:ascii="Times New Roman" w:hAnsi="Times New Roman" w:eastAsia="Times New Roman"/>
-          <w:b w:val="0"/>
-          <w:i w:val="0"/>
-          <w:sz w:val="22"/>
-        </w:rPr>
-        <w:t xml:space="preserve">        legal heirs inherite d the said properly . Since, the partner ship is not</w:t>
-      </w:r>
-    </w:p>
-    <w:p>
-      <w:r>
-        <w:rPr>
-          <w:rFonts w:ascii="Times New Roman" w:hAnsi="Times New Roman" w:eastAsia="Times New Roman"/>
-          <w:b w:val="0"/>
-          <w:i w:val="0"/>
-          <w:sz w:val="22"/>
-        </w:rPr>
-        <w:t xml:space="preserve">        going forward and legal represen tatives ,u·c not coo11crnting, n notice</w:t>
-      </w:r>
-    </w:p>
-    <w:p>
-      <w:r>
-        <w:rPr>
-          <w:rFonts w:ascii="Times New Roman" w:hAnsi="Times New Roman" w:eastAsia="Times New Roman"/>
-          <w:b w:val="0"/>
-          <w:i w:val="0"/>
-          <w:sz w:val="22"/>
-        </w:rPr>
-        <w:t xml:space="preserve">        having an arbitrat ion clause was issued lo 'Respon dents. llowcvc r, vidc</w:t>
-      </w:r>
-    </w:p>
-    <w:p>
-      <w:r>
-        <w:rPr>
-          <w:rFonts w:ascii="Times New Roman" w:hAnsi="Times New Roman" w:eastAsia="Times New Roman"/>
-          <w:b w:val="0"/>
-          <w:i w:val="0"/>
-          <w:sz w:val="22"/>
-        </w:rPr>
-        <w:t xml:space="preserve">         their reply dated 11.03.20 24, they 1•cfuscd to rcfci• the n1ntter· to the</w:t>
-      </w:r>
-    </w:p>
-    <w:p/>
-    <w:p>
-      <w:r>
-        <w:rPr>
-          <w:rFonts w:ascii="Times New Roman" w:hAnsi="Times New Roman" w:eastAsia="Times New Roman"/>
-          <w:b/>
-          <w:i w:val="0"/>
-          <w:color w:val="8B2E2E"/>
-          <w:sz w:val="26"/>
-        </w:rPr>
-        <w:t>Page 4 of 4</w:t>
-      </w:r>
-    </w:p>
-    <w:p>
-      <w:r>
-        <w:rPr>
-          <w:rFonts w:ascii="Times New Roman" w:hAnsi="Times New Roman" w:eastAsia="Times New Roman"/>
-          <w:b w:val="0"/>
-          <w:i w:val="0"/>
-          <w:sz w:val="22"/>
-        </w:rPr>
-        <w:t>I                                                                                   I</w:t>
-      </w:r>
-    </w:p>
-    <w:p>
-      <w:r>
-        <w:rPr>
-          <w:rFonts w:ascii="Times New Roman" w:hAnsi="Times New Roman" w:eastAsia="Times New Roman"/>
-          <w:b w:val="0"/>
-          <w:i w:val="0"/>
-          <w:sz w:val="22"/>
-        </w:rPr>
-        <w:t xml:space="preserve">                                                                                    ,</w:t>
+        <w:t>~-. Apart from</w:t>
       </w:r>
     </w:p>
     <w:p>
@@ -1461,271 +1294,7 @@
           <w:i w:val="0"/>
           <w:sz w:val="22"/>
         </w:rPr>
-        <w:t>I   Arb itra tor.</w:t>
-      </w:r>
-    </w:p>
-    <w:p>
-      <w:r>
-        <w:rPr>
-          <w:rFonts w:ascii="Times New Roman" w:hAnsi="Times New Roman" w:eastAsia="Times New Roman"/>
-          <w:b w:val="0"/>
-          <w:i w:val="0"/>
-          <w:sz w:val="22"/>
-        </w:rPr>
-        <w:t xml:space="preserve">                                                          on 07. 08. 202 4.</w:t>
-      </w:r>
-    </w:p>
-    <w:p>
-      <w:r>
-        <w:rPr>
-          <w:rFonts w:ascii="Times New Roman" w:hAnsi="Times New Roman" w:eastAsia="Times New Roman"/>
-          <w:b w:val="0"/>
-          <w:i w:val="0"/>
-          <w:sz w:val="22"/>
-        </w:rPr>
-        <w:t xml:space="preserve">    5.     Issu e not ice to Rcs pon dcn l's retu rna ble</w:t>
-      </w:r>
-    </w:p>
-    <w:p>
-      <w:r>
-        <w:rPr>
-          <w:rFonts w:ascii="Times New Roman" w:hAnsi="Times New Roman" w:eastAsia="Times New Roman"/>
-          <w:b w:val="0"/>
-          <w:i w:val="0"/>
-          <w:sz w:val="22"/>
-        </w:rPr>
-        <w:t>I          Apa rt from reg ula r serv ice, serv ice by</w:t>
-      </w:r>
-    </w:p>
-    <w:p>
-      <w:r>
-        <w:rPr>
-          <w:rFonts w:ascii="Times New Roman" w:hAnsi="Times New Roman" w:eastAsia="Times New Roman"/>
-          <w:b w:val="0"/>
-          <w:i w:val="0"/>
-          <w:sz w:val="22"/>
-        </w:rPr>
-        <w:t xml:space="preserve">                                                        oth er ,no des is pcr mi ltcd .</w:t>
-      </w:r>
-    </w:p>
-    <w:p>
-      <w:r>
-        <w:rPr>
-          <w:rFonts w:ascii="Times New Roman" w:hAnsi="Times New Roman" w:eastAsia="Times New Roman"/>
-          <w:b w:val="0"/>
-          <w:i w:val="0"/>
-          <w:sz w:val="22"/>
-        </w:rPr>
-        <w:t xml:space="preserve">    ~-.             ~   ~·   I</w:t>
-      </w:r>
-    </w:p>
-    <w:p>
-      <w:r>
-        <w:rPr>
-          <w:rFonts w:ascii="Times New Roman" w:hAnsi="Times New Roman" w:eastAsia="Times New Roman"/>
-          <w:b w:val="0"/>
-          <w:i w:val="0"/>
-          <w:sz w:val="22"/>
-        </w:rPr>
-        <w:t>I</w:t>
-      </w:r>
-    </w:p>
-    <w:p>
-      <w:r>
-        <w:rPr>
-          <w:rFonts w:ascii="Times New Roman" w:hAnsi="Times New Roman" w:eastAsia="Times New Roman"/>
-          <w:b w:val="0"/>
-          <w:i w:val="0"/>
-          <w:sz w:val="22"/>
-        </w:rPr>
-        <w:t xml:space="preserve">              I(</w:t>
-      </w:r>
-    </w:p>
-    <w:p>
-      <w:r>
-        <w:rPr>
-          <w:rFonts w:ascii="Times New Roman" w:hAnsi="Times New Roman" w:eastAsia="Times New Roman"/>
-          <w:b w:val="0"/>
-          <w:i w:val="0"/>
-          <w:sz w:val="22"/>
-        </w:rPr>
-        <w:t xml:space="preserve">                        '                                                                                   J</w:t>
-      </w:r>
-    </w:p>
-    <w:p>
-      <w:r>
-        <w:rPr>
-          <w:rFonts w:ascii="Times New Roman" w:hAnsi="Times New Roman" w:eastAsia="Times New Roman"/>
-          <w:b w:val="0"/>
-          <w:i w:val="0"/>
-          <w:sz w:val="22"/>
-        </w:rPr>
-        <w:t xml:space="preserve">                                                               above orde r of this JIon'blc Court. 'the</w:t>
-      </w:r>
-    </w:p>
-    <w:p>
-      <w:r>
-        <w:rPr>
-          <w:rFonts w:ascii="Times New Roman" w:hAnsi="Times New Roman" w:eastAsia="Times New Roman"/>
-          <w:b w:val="0"/>
-          <w:i w:val="0"/>
-          <w:sz w:val="22"/>
-        </w:rPr>
-        <w:t xml:space="preserve">            You are, therefore, required to take note of the                                          o~</w:t>
-      </w:r>
-    </w:p>
-    <w:p>
-      <w:r>
-        <w:rPr>
-          <w:rFonts w:ascii="Times New Roman" w:hAnsi="Times New Roman" w:eastAsia="Times New Roman"/>
-          <w:b w:val="0"/>
-          <w:i w:val="0"/>
-          <w:sz w:val="22"/>
-        </w:rPr>
-        <w:t>i                                                     or No. 13/2 024 , will come up for ~d~ issi</w:t>
-      </w:r>
-    </w:p>
-    <w:p>
-      <w:r>
-        <w:rPr>
-          <w:rFonts w:ascii="Times New Roman" w:hAnsi="Times New Roman" w:eastAsia="Times New Roman"/>
-          <w:b w:val="0"/>
-          <w:i w:val="0"/>
-          <w:sz w:val="22"/>
-        </w:rPr>
-        <w:t xml:space="preserve">    above Application for App oint men t of Arbitraton any othe r day as per the convcn1ence of this .</w:t>
-      </w:r>
-    </w:p>
-    <w:p>
-      <w:r>
-        <w:rPr>
-          <w:rFonts w:ascii="Times New Roman" w:hAnsi="Times New Roman" w:eastAsia="Times New Roman"/>
-          <w:b w:val="0"/>
-          <w:i w:val="0"/>
-          <w:sz w:val="22"/>
-        </w:rPr>
-        <w:t xml:space="preserve">                                                   er</w:t>
-      </w:r>
-    </w:p>
-    <w:p>
-      <w:r>
-        <w:rPr>
-          <w:rFonts w:ascii="Times New Roman" w:hAnsi="Times New Roman" w:eastAsia="Times New Roman"/>
-          <w:b w:val="0"/>
-          <w:i w:val="0"/>
-          <w:sz w:val="22"/>
-        </w:rPr>
-        <w:t xml:space="preserve">    on 07/ 08/ 202 4 at 10.3 0 a.m . or thereaft        r behalf eith er in pers on or by an Advocate</w:t>
-      </w:r>
-    </w:p>
-    <w:p>
-      <w:r>
-        <w:rPr>
-          <w:rFonts w:ascii="Times New Roman" w:hAnsi="Times New Roman" w:eastAsia="Times New Roman"/>
-          <w:b w:val="0"/>
-          <w:i w:val="0"/>
-          <w:sz w:val="22"/>
-        </w:rPr>
-        <w:t xml:space="preserve">                                                                                                       of</w:t>
-      </w:r>
-    </w:p>
-    <w:p>
-      <w:r>
-        <w:rPr>
-          <w:rFonts w:ascii="Times New Roman" w:hAnsi="Times New Roman" w:eastAsia="Times New Roman"/>
-          <w:b w:val="0"/>
-          <w:i w:val="0"/>
-          <w:sz w:val="22"/>
-        </w:rPr>
-        <w:t>I   C~u rt and that if no app eara nce is mad e on you</w:t>
-      </w:r>
-    </w:p>
-    <w:p>
-      <w:r>
-        <w:rPr>
-          <w:rFonts w:ascii="Times New Roman" w:hAnsi="Times New Roman" w:eastAsia="Times New Roman"/>
-          <w:b w:val="0"/>
-          <w:i w:val="0"/>
-          <w:sz w:val="22"/>
-        </w:rPr>
-        <w:t xml:space="preserve">                                                                  you, it will be hea rd and dete rmin ed         •</w:t>
-      </w:r>
-    </w:p>
-    <w:p>
-      <w:r>
-        <w:rPr>
-          <w:rFonts w:ascii="Times New Roman" w:hAnsi="Times New Roman" w:eastAsia="Times New Roman"/>
-          <w:b w:val="0"/>
-          <w:i w:val="0"/>
-          <w:sz w:val="22"/>
-        </w:rPr>
-        <w:t xml:space="preserve">      1s Cou rt or an Agent duly auth oriz ed and inst ruct ed by</w:t>
-      </w:r>
-    </w:p>
-    <w:p>
-      <w:r>
-        <w:rPr>
-          <w:rFonts w:ascii="Times New Roman" w:hAnsi="Times New Roman" w:eastAsia="Times New Roman"/>
-          <w:b w:val="0"/>
-          <w:i w:val="0"/>
-          <w:sz w:val="22"/>
-        </w:rPr>
-        <w:t xml:space="preserve">    !11</w:t>
-      </w:r>
-    </w:p>
-    <w:p>
-      <w:r>
-        <w:rPr>
-          <w:rFonts w:ascii="Times New Roman" w:hAnsi="Times New Roman" w:eastAsia="Times New Roman"/>
-          <w:b w:val="0"/>
-          <w:i w:val="0"/>
-          <w:sz w:val="22"/>
-        </w:rPr>
-        <w:t>I   1n you r absence.</w:t>
-      </w:r>
-    </w:p>
-    <w:p>
-      <w:r>
-        <w:rPr>
-          <w:rFonts w:ascii="Times New Roman" w:hAnsi="Times New Roman" w:eastAsia="Times New Roman"/>
-          <w:b w:val="0"/>
-          <w:i w:val="0"/>
-          <w:sz w:val="22"/>
-        </w:rPr>
-        <w:t xml:space="preserve">                                                                                                                1</w:t>
-      </w:r>
-    </w:p>
-    <w:p>
-      <w:r>
-        <w:rPr>
-          <w:rFonts w:ascii="Times New Roman" w:hAnsi="Times New Roman" w:eastAsia="Times New Roman"/>
-          <w:b w:val="0"/>
-          <w:i w:val="0"/>
-          <w:sz w:val="22"/>
-        </w:rPr>
-        <w:t xml:space="preserve">                                                                                                                .r</w:t>
-      </w:r>
-    </w:p>
-    <w:p>
-      <w:r>
-        <w:rPr>
-          <w:rFonts w:ascii="Times New Roman" w:hAnsi="Times New Roman" w:eastAsia="Times New Roman"/>
-          <w:b w:val="0"/>
-          <w:i w:val="0"/>
-          <w:sz w:val="22"/>
-        </w:rPr>
-        <w:t xml:space="preserve">                                                              esaid, this Cou rt wi11 pass an orde r as</w:t>
-      </w:r>
-    </w:p>
-    <w:p>
-      <w:r>
-        <w:rPr>
-          <w:rFonts w:ascii="Times New Roman" w:hAnsi="Times New Roman" w:eastAsia="Times New Roman"/>
-          <w:b w:val="0"/>
-          <w:i w:val="0"/>
-          <w:sz w:val="22"/>
-        </w:rPr>
-        <w:t xml:space="preserve">            If you, fail to app ear and show cause as afor</w:t>
+        <w:t>I( ~ ~·</w:t>
       </w:r>
     </w:p>
     <w:p>
@@ -1747,7 +1316,7 @@
           <w:i w:val="0"/>
           <w:sz w:val="22"/>
         </w:rPr>
-        <w:t>I   pray ed for by the applicants or such othe r orde</w:t>
+        <w:t>Court.  'the</w:t>
       </w:r>
     </w:p>
     <w:p>
@@ -1758,7 +1327,7 @@
           <w:i w:val="0"/>
           <w:sz w:val="22"/>
         </w:rPr>
-        <w:t xml:space="preserve">                                                      r as this Court may dee m prop er.</w:t>
+        <w:t>of the above order of this J Ion'blc</w:t>
       </w:r>
     </w:p>
     <w:p>
@@ -1769,7 +1338,7 @@
           <w:i w:val="0"/>
           <w:sz w:val="22"/>
         </w:rPr>
-        <w:t xml:space="preserve">                                                        a Kumar Upadhyaya, the Chief Just ice of</w:t>
+        <w:t>You are, therefore, required to take note</w:t>
       </w:r>
     </w:p>
     <w:p>
@@ -1780,7 +1349,7 @@
           <w:i w:val="0"/>
           <w:sz w:val="22"/>
         </w:rPr>
-        <w:t xml:space="preserve">                                                                                                      •         ...</w:t>
+        <w:t>will come up for ~d~issio~</w:t>
       </w:r>
     </w:p>
     <w:p>
@@ -1791,7 +1360,7 @@
           <w:i w:val="0"/>
           <w:sz w:val="22"/>
         </w:rPr>
-        <w:t>I        . WITNESS, the Hon 'ble Shri Just ice D.evendr</w:t>
+        <w:t>above Application for Appointment of Arbitrator No.  13/2024, of this .</w:t>
       </w:r>
     </w:p>
     <w:p>
@@ -1802,7 +1371,7 @@
           <w:i w:val="0"/>
           <w:sz w:val="22"/>
         </w:rPr>
-        <w:t xml:space="preserve">                                                  d this 30th day of July, 202 4.</w:t>
+        <w:t>or thereafter on any other day as per the convcn1ence</w:t>
       </w:r>
     </w:p>
     <w:p>
@@ -1813,7 +1382,7 @@
           <w:i w:val="0"/>
           <w:sz w:val="22"/>
         </w:rPr>
-        <w:t xml:space="preserve">    the High Court of Bombay-at Bombay, aforesai</w:t>
+        <w:t>on 07/08/2024 at 10.30 a.m.</w:t>
       </w:r>
     </w:p>
     <w:p>
@@ -1824,7 +1393,7 @@
           <w:i w:val="0"/>
           <w:sz w:val="22"/>
         </w:rPr>
-        <w:t>I                                                                   By orde r of the Court,</w:t>
+        <w:t>either in person or by an Advocate of</w:t>
       </w:r>
     </w:p>
     <w:p>
@@ -1835,7 +1404,7 @@
           <w:i w:val="0"/>
           <w:sz w:val="22"/>
         </w:rPr>
-        <w:t>I</w:t>
+        <w:t>C~urt and that if no appearance is made on your behalf heard and determined</w:t>
       </w:r>
     </w:p>
     <w:p>
@@ -1846,7 +1415,7 @@
           <w:i w:val="0"/>
           <w:sz w:val="22"/>
         </w:rPr>
-        <w:t xml:space="preserve">                                                                         cs ~!  ~~</w:t>
+        <w:t>and instructed by you, it will be</w:t>
       </w:r>
     </w:p>
     <w:p>
@@ -1857,7 +1426,7 @@
           <w:i w:val="0"/>
           <w:sz w:val="22"/>
         </w:rPr>
-        <w:t xml:space="preserve">                                                                   Assistant Registrar,</w:t>
+        <w:t>!11&lt;sup&gt;1&lt;/sup&gt;s Court or an Agent duly authorized</w:t>
       </w:r>
     </w:p>
     <w:p>
@@ -1868,7 +1437,7 @@
           <w:i w:val="0"/>
           <w:sz w:val="22"/>
         </w:rPr>
-        <w:t>'</w:t>
+        <w:t>1n your absence.</w:t>
       </w:r>
     </w:p>
     <w:p>
@@ -1879,7 +1448,7 @@
           <w:i w:val="0"/>
           <w:sz w:val="22"/>
         </w:rPr>
-        <w:t>;</w:t>
+        <w:t>order as</w:t>
       </w:r>
     </w:p>
     <w:p>
@@ -1890,7 +1459,7 @@
           <w:i w:val="0"/>
           <w:sz w:val="22"/>
         </w:rPr>
-        <w:t xml:space="preserve">    srp</w:t>
+        <w:t>as  aforesaid,  this Court wi11  pass an</w:t>
       </w:r>
     </w:p>
     <w:p>
@@ -1901,7 +1470,7 @@
           <w:i w:val="0"/>
           <w:sz w:val="22"/>
         </w:rPr>
-        <w:t xml:space="preserve">                                                              High Court of Bombay at Goa,</w:t>
+        <w:t>If you,  fail  to appear and show cause •</w:t>
       </w:r>
     </w:p>
     <w:p>
@@ -1912,7 +1481,7 @@
           <w:i w:val="0"/>
           <w:sz w:val="22"/>
         </w:rPr>
-        <w:t xml:space="preserve">                                                                    Porvorim, Goa.</w:t>
+        <w:t>order as this Court may deem proper.</w:t>
       </w:r>
     </w:p>
     <w:p>
@@ -1923,7 +1492,7 @@
           <w:i w:val="0"/>
           <w:sz w:val="22"/>
         </w:rPr>
-        <w:t xml:space="preserve">                                                                  f(/'</w:t>
+        <w:t>prayed for by the applicants or such other</w:t>
       </w:r>
     </w:p>
     <w:p>
@@ -1934,7 +1503,7 @@
           <w:i w:val="0"/>
           <w:sz w:val="22"/>
         </w:rPr>
-        <w:t>'</w:t>
+        <w:t>of</w:t>
       </w:r>
     </w:p>
     <w:p>
@@ -1945,7 +1514,7 @@
           <w:i w:val="0"/>
           <w:sz w:val="22"/>
         </w:rPr>
-        <w:t>a</w:t>
+        <w:t>Kumar Upadhyaya, the Chief Justice</w:t>
       </w:r>
     </w:p>
     <w:p>
@@ -1956,7 +1525,7 @@
           <w:i w:val="0"/>
           <w:sz w:val="22"/>
         </w:rPr>
-        <w:t>I</w:t>
+        <w:t>. WITNESS, the Hon'ble Shri Justice D.evendra</w:t>
       </w:r>
     </w:p>
     <w:p>
@@ -1967,7 +1536,7 @@
           <w:i w:val="0"/>
           <w:sz w:val="22"/>
         </w:rPr>
-        <w:t>I</w:t>
+        <w:t>Bombay, aforesaid this 30th day of July,  2024.</w:t>
       </w:r>
     </w:p>
     <w:p>
@@ -1978,7 +1547,7 @@
           <w:i w:val="0"/>
           <w:sz w:val="22"/>
         </w:rPr>
-        <w:t>'</w:t>
+        <w:t>the High Court of Bombay-at</w:t>
       </w:r>
     </w:p>
     <w:p>
@@ -1989,7 +1558,7 @@
           <w:i w:val="0"/>
           <w:sz w:val="22"/>
         </w:rPr>
-        <w:t>I</w:t>
+        <w:t>srp</w:t>
       </w:r>
     </w:p>
     <w:p>
@@ -2000,7 +1569,7 @@
           <w:i w:val="0"/>
           <w:sz w:val="22"/>
         </w:rPr>
-        <w:t>I</w:t>
+        <w:t>By order of the Court,</w:t>
       </w:r>
     </w:p>
     <w:p>
@@ -2011,7 +1580,7 @@
           <w:i w:val="0"/>
           <w:sz w:val="22"/>
         </w:rPr>
-        <w:t>I</w:t>
+        <w:t>UNITED STATES OF AMERICA</w:t>
       </w:r>
     </w:p>
     <w:p>
@@ -2022,7 +1591,7 @@
           <w:i w:val="0"/>
           <w:sz w:val="22"/>
         </w:rPr>
-        <w:t>'</w:t>
+        <w:t>cs~!~~</w:t>
       </w:r>
     </w:p>
     <w:p>
@@ -2033,7 +1602,7 @@
           <w:i w:val="0"/>
           <w:sz w:val="22"/>
         </w:rPr>
-        <w:t>I</w:t>
+        <w:t>Assistant Registrar,</w:t>
       </w:r>
     </w:p>
     <w:p>
@@ -2044,7 +1613,7 @@
           <w:i w:val="0"/>
           <w:sz w:val="22"/>
         </w:rPr>
-        <w:t>I</w:t>
+        <w:t>High Court of Bombay at Goa,</w:t>
       </w:r>
     </w:p>
     <w:p>
@@ -2055,7 +1624,7 @@
           <w:i w:val="0"/>
           <w:sz w:val="22"/>
         </w:rPr>
-        <w:t>I</w:t>
+        <w:t>Porvorim, Goa.</w:t>
       </w:r>
     </w:p>
     <w:p>
@@ -2066,32 +1635,9 @@
           <w:i w:val="0"/>
           <w:sz w:val="22"/>
         </w:rPr>
-        <w:t>'</w:t>
+        <w:t>f(/'</w:t>
       </w:r>
     </w:p>
-    <w:p>
-      <w:r>
-        <w:rPr>
-          <w:rFonts w:ascii="Times New Roman" w:hAnsi="Times New Roman" w:eastAsia="Times New Roman"/>
-          <w:b w:val="0"/>
-          <w:i w:val="0"/>
-          <w:sz w:val="22"/>
-        </w:rPr>
-        <w:t>I</w:t>
-      </w:r>
-    </w:p>
-    <w:p>
-      <w:r>
-        <w:rPr>
-          <w:rFonts w:ascii="Times New Roman" w:hAnsi="Times New Roman" w:eastAsia="Times New Roman"/>
-          <w:b w:val="0"/>
-          <w:i w:val="0"/>
-          <w:sz w:val="22"/>
-        </w:rPr>
-        <w:t>a</w:t>
-      </w:r>
-    </w:p>
-    <w:p/>
     <w:sectPr>
       <w:headerReference w:type="default" r:id="rId9"/>
       <w:footerReference w:type="default" r:id="rId10"/>

</xml_diff>